<commit_message>
Add train/val/test holdout split and rename WBF-3/Average-3 to WBF-CV/Average-CV in notebook 08
Expand K-fold candidates to 8 models with a nested holdout-test evaluation
(pool K-fold + 15% held-out test, plus a single final retrain on the full
pool) in notebook 08, sync executed results for notebook 09, and update the
executive summary docx. Drop the now-superseded BAO_CAO.md.

Co-Authored-By: Claude Sonnet 5 <noreply@anthropic.com>
</commit_message>
<xml_diff>
--- a/reports/Bao_cao_nghien_cuu.docx
+++ b/reports/Bao_cao_nghien_cuu.docx
@@ -14631,7 +14631,7 @@
             </w:pPr>
             <w:r>
               <w:rPr/>
-              <w:t>0,9451 ± 0,0036</w:t>
+              <w:t>0,9505 ± 0,0034</w:t>
             </w:r>
           </w:p>
         </w:tc>
@@ -14700,7 +14700,7 @@
             </w:pPr>
             <w:r>
               <w:rPr/>
-              <w:t>0,7157 ± 0,0104</w:t>
+              <w:t>0,7244 ± 0,0117</w:t>
             </w:r>
           </w:p>
         </w:tc>
@@ -14769,7 +14769,7 @@
             </w:pPr>
             <w:r>
               <w:rPr/>
-              <w:t>0,8842 ± 0,0137</w:t>
+              <w:t>0,8898 ± 0,0133</w:t>
             </w:r>
           </w:p>
         </w:tc>
@@ -14832,7 +14832,7 @@
             </w:pPr>
             <w:r>
               <w:rPr/>
-              <w:t>0,8818 ± 0,0178</w:t>
+              <w:t>0,8892 ± 0,0117</w:t>
             </w:r>
           </w:p>
         </w:tc>
@@ -14895,7 +14895,7 @@
             </w:pPr>
             <w:r>
               <w:rPr/>
-              <w:t>≈ 0,395</w:t>
+              <w:t>≈ 0,412</w:t>
             </w:r>
           </w:p>
         </w:tc>
@@ -14958,7 +14958,7 @@
             </w:pPr>
             <w:r>
               <w:rPr/>
-              <w:t>0,9887 ± 0,0012</w:t>
+              <w:t>0,9893 ± 0,0012</w:t>
             </w:r>
           </w:p>
         </w:tc>
@@ -15021,7 +15021,7 @@
             </w:pPr>
             <w:r>
               <w:rPr/>
-              <w:t>0,5476 ± 0,0283</w:t>
+              <w:t>0,5639 ± 0,0203</w:t>
             </w:r>
           </w:p>
         </w:tc>
@@ -15088,7 +15088,7 @@
               <w:rPr>
                 <w:lang w:val="en-US"/>
               </w:rPr>
-              <w:t>Loại được 77,4% bệnh nhân, NPV 0,9901 (95% CI [0,9885; 0,9916])</w:t>
+              <w:t>Loại được 80,4% bệnh nhân, NPV 0,9901 (95% CI [0,9885; 0,9917])</w:t>
             </w:r>
           </w:p>
         </w:tc>
@@ -15105,39 +15105,35 @@
           <w:color w:val="000000"/>
           <w:lang w:val="en-US"/>
         </w:rPr>
-        <w:t xml:space="preserve">Model </w:t>
-      </w:r>
-      <w:r>
-        <w:rPr>
-          <w:rFonts w:ascii="Times New Roman" w:hAnsi="Times New Roman" w:eastAsia="Times New Roman" w:cs="Times New Roman"/>
-          <w:color w:val="000000"/>
-          <w:lang w:val="en-US"/>
-        </w:rPr>
-        <w:t>tốt</w:t>
-      </w:r>
-      <w:r>
-        <w:rPr>
-          <w:rFonts w:ascii="Times New Roman" w:hAnsi="Times New Roman" w:eastAsia="Times New Roman" w:cs="Times New Roman"/>
-          <w:color w:val="000000"/>
-          <w:lang w:val="en-US"/>
-        </w:rPr>
-        <w:t xml:space="preserve"> </w:t>
-      </w:r>
-      <w:r>
-        <w:rPr>
-          <w:rFonts w:ascii="Times New Roman" w:hAnsi="Times New Roman" w:eastAsia="Times New Roman" w:cs="Times New Roman"/>
-          <w:color w:val="000000"/>
-          <w:lang w:val="en-US"/>
-        </w:rPr>
-        <w:t>nhất</w:t>
-      </w:r>
-      <w:r>
-        <w:rPr>
-          <w:rFonts w:ascii="Times New Roman" w:hAnsi="Times New Roman" w:eastAsia="Times New Roman" w:cs="Times New Roman"/>
-          <w:color w:val="000000"/>
-          <w:lang w:val="en-US"/>
-        </w:rPr>
-        <w:t xml:space="preserve">: </w:t>
+        <w:t>Model tốt nhất: Average-3 (trung bình 8 model — PlainCNN, XResNet1D, ConvNeXtV2_1D, AiTiAMI, ResNet1D, SEResNet1D, CNN+BiLSTM, InceptionTime1D, mở rộng từ 3 model theo ngưỡng nhiễu ±0,015 AUROC) — tốt hơn tất cả 8 model đơn trên cả 5 fold (p = 0,031 mỗi so sánh), không phân biệt được thống kê với WBF-3 (ensemble có trọng số, CI của chênh lệch chứa 0). Xác nhận bằng 5-fold CV theo bệnh nhân.</w:t>
+      </w:r>
+      <w:r>
+        <w:rPr>
+          <w:rFonts w:ascii="Times New Roman" w:hAnsi="Times New Roman" w:eastAsia="Times New Roman" w:cs="Times New Roman"/>
+          <w:color w:val="000000"/>
+          <w:lang w:val="en-US"/>
+        </w:rPr>
+      </w:r>
+      <w:r>
+        <w:rPr>
+          <w:rFonts w:ascii="Times New Roman" w:hAnsi="Times New Roman" w:eastAsia="Times New Roman" w:cs="Times New Roman"/>
+          <w:color w:val="000000"/>
+          <w:lang w:val="en-US"/>
+        </w:rPr>
+      </w:r>
+      <w:r>
+        <w:rPr>
+          <w:rFonts w:ascii="Times New Roman" w:hAnsi="Times New Roman" w:eastAsia="Times New Roman" w:cs="Times New Roman"/>
+          <w:color w:val="000000"/>
+          <w:lang w:val="en-US"/>
+        </w:rPr>
+      </w:r>
+      <w:r>
+        <w:rPr>
+          <w:rFonts w:ascii="Times New Roman" w:hAnsi="Times New Roman" w:eastAsia="Times New Roman" w:cs="Times New Roman"/>
+          <w:color w:val="000000"/>
+          <w:lang w:val="en-US"/>
+        </w:rPr>
       </w:r>
       <w:r>
         <w:rPr>
@@ -15147,47 +15143,41 @@
           <w:color w:val="000000"/>
           <w:lang w:val="en-US"/>
         </w:rPr>
-        <w:t>Average-3</w:t>
-      </w:r>
-      <w:r>
-        <w:rPr>
-          <w:rFonts w:ascii="Times New Roman" w:hAnsi="Times New Roman" w:eastAsia="Times New Roman" w:cs="Times New Roman"/>
-          <w:color w:val="000000"/>
-          <w:lang w:val="en-US"/>
-        </w:rPr>
-        <w:t xml:space="preserve"> (</w:t>
-      </w:r>
-      <w:r>
-        <w:rPr>
-          <w:rFonts w:ascii="Times New Roman" w:hAnsi="Times New Roman" w:eastAsia="Times New Roman" w:cs="Times New Roman"/>
-          <w:color w:val="000000"/>
-          <w:lang w:val="en-US"/>
-        </w:rPr>
-        <w:t>trung</w:t>
-      </w:r>
-      <w:r>
-        <w:rPr>
-          <w:rFonts w:ascii="Times New Roman" w:hAnsi="Times New Roman" w:eastAsia="Times New Roman" w:cs="Times New Roman"/>
-          <w:color w:val="000000"/>
-          <w:lang w:val="en-US"/>
-        </w:rPr>
-        <w:t xml:space="preserve"> </w:t>
-      </w:r>
-      <w:r>
-        <w:rPr>
-          <w:rFonts w:ascii="Times New Roman" w:hAnsi="Times New Roman" w:eastAsia="Times New Roman" w:cs="Times New Roman"/>
-          <w:color w:val="000000"/>
-          <w:lang w:val="en-US"/>
-        </w:rPr>
-        <w:t>bình</w:t>
-      </w:r>
-      <w:r>
-        <w:rPr>
-          <w:rFonts w:ascii="Times New Roman" w:hAnsi="Times New Roman" w:eastAsia="Times New Roman" w:cs="Times New Roman"/>
-          <w:color w:val="000000"/>
-          <w:lang w:val="en-US"/>
-        </w:rPr>
-        <w:t xml:space="preserve"> </w:t>
+      </w:r>
+      <w:r>
+        <w:rPr>
+          <w:rFonts w:ascii="Times New Roman" w:hAnsi="Times New Roman" w:eastAsia="Times New Roman" w:cs="Times New Roman"/>
+          <w:color w:val="000000"/>
+          <w:lang w:val="en-US"/>
+        </w:rPr>
+      </w:r>
+      <w:r>
+        <w:rPr>
+          <w:rFonts w:ascii="Times New Roman" w:hAnsi="Times New Roman" w:eastAsia="Times New Roman" w:cs="Times New Roman"/>
+          <w:color w:val="000000"/>
+          <w:lang w:val="en-US"/>
+        </w:rPr>
+      </w:r>
+      <w:r>
+        <w:rPr>
+          <w:rFonts w:ascii="Times New Roman" w:hAnsi="Times New Roman" w:eastAsia="Times New Roman" w:cs="Times New Roman"/>
+          <w:color w:val="000000"/>
+          <w:lang w:val="en-US"/>
+        </w:rPr>
+      </w:r>
+      <w:r>
+        <w:rPr>
+          <w:rFonts w:ascii="Times New Roman" w:hAnsi="Times New Roman" w:eastAsia="Times New Roman" w:cs="Times New Roman"/>
+          <w:color w:val="000000"/>
+          <w:lang w:val="en-US"/>
+        </w:rPr>
+      </w:r>
+      <w:r>
+        <w:rPr>
+          <w:rFonts w:ascii="Times New Roman" w:hAnsi="Times New Roman" w:eastAsia="Times New Roman" w:cs="Times New Roman"/>
+          <w:color w:val="000000"/>
+          <w:lang w:val="en-US"/>
+        </w:rPr>
       </w:r>
       <w:r>
         <w:rPr>
@@ -15197,15 +15187,13 @@
           <w:color w:val="000000"/>
           <w:lang w:val="en-US"/>
         </w:rPr>
-        <w:t>PlainCNN</w:t>
-      </w:r>
-      <w:r>
-        <w:rPr>
-          <w:rFonts w:ascii="Times New Roman" w:hAnsi="Times New Roman" w:eastAsia="Times New Roman" w:cs="Times New Roman"/>
-          <w:color w:val="000000"/>
-          <w:lang w:val="en-US"/>
-        </w:rPr>
-        <w:t xml:space="preserve"> + </w:t>
+      </w:r>
+      <w:r>
+        <w:rPr>
+          <w:rFonts w:ascii="Times New Roman" w:hAnsi="Times New Roman" w:eastAsia="Times New Roman" w:cs="Times New Roman"/>
+          <w:color w:val="000000"/>
+          <w:lang w:val="en-US"/>
+        </w:rPr>
       </w:r>
       <w:r>
         <w:rPr>
@@ -15215,15 +15203,13 @@
           <w:color w:val="000000"/>
           <w:lang w:val="en-US"/>
         </w:rPr>
-        <w:t>ResNet1D</w:t>
-      </w:r>
-      <w:r>
-        <w:rPr>
-          <w:rFonts w:ascii="Times New Roman" w:hAnsi="Times New Roman" w:eastAsia="Times New Roman" w:cs="Times New Roman"/>
-          <w:color w:val="000000"/>
-          <w:lang w:val="en-US"/>
-        </w:rPr>
-        <w:t xml:space="preserve"> + </w:t>
+      </w:r>
+      <w:r>
+        <w:rPr>
+          <w:rFonts w:ascii="Times New Roman" w:hAnsi="Times New Roman" w:eastAsia="Times New Roman" w:cs="Times New Roman"/>
+          <w:color w:val="000000"/>
+          <w:lang w:val="en-US"/>
+        </w:rPr>
       </w:r>
       <w:r>
         <w:rPr>
@@ -15233,215 +15219,188 @@
           <w:color w:val="000000"/>
           <w:lang w:val="en-US"/>
         </w:rPr>
-        <w:t>XResNet1D</w:t>
-      </w:r>
-      <w:r>
-        <w:rPr>
-          <w:rFonts w:ascii="Times New Roman" w:hAnsi="Times New Roman" w:eastAsia="Times New Roman" w:cs="Times New Roman"/>
-          <w:color w:val="000000"/>
-          <w:lang w:val="en-US"/>
-        </w:rPr>
-        <w:t xml:space="preserve">) — </w:t>
-      </w:r>
-      <w:r>
-        <w:rPr>
-          <w:rFonts w:ascii="Times New Roman" w:hAnsi="Times New Roman" w:eastAsia="Times New Roman" w:cs="Times New Roman"/>
-          <w:color w:val="000000"/>
-          <w:lang w:val="en-US"/>
-        </w:rPr>
-        <w:t>t</w:t>
-      </w:r>
-      <w:r>
-        <w:rPr>
-          <w:rFonts w:ascii="Times New Roman" w:hAnsi="Times New Roman" w:eastAsia="Times New Roman" w:cs="Times New Roman"/>
-          <w:color w:val="000000"/>
-          <w:lang w:val="en-US"/>
-        </w:rPr>
-        <w:t>ốt</w:t>
-      </w:r>
-      <w:r>
-        <w:rPr>
-          <w:rFonts w:ascii="Times New Roman" w:hAnsi="Times New Roman" w:eastAsia="Times New Roman" w:cs="Times New Roman"/>
-          <w:color w:val="000000"/>
-          <w:lang w:val="en-US"/>
-        </w:rPr>
-        <w:t xml:space="preserve"> </w:t>
-      </w:r>
-      <w:r>
-        <w:rPr>
-          <w:rFonts w:ascii="Times New Roman" w:hAnsi="Times New Roman" w:eastAsia="Times New Roman" w:cs="Times New Roman"/>
-          <w:color w:val="000000"/>
-          <w:lang w:val="en-US"/>
-        </w:rPr>
-        <w:t>hơn</w:t>
-      </w:r>
-      <w:r>
-        <w:rPr>
-          <w:rFonts w:ascii="Times New Roman" w:hAnsi="Times New Roman" w:eastAsia="Times New Roman" w:cs="Times New Roman"/>
-          <w:color w:val="000000"/>
-          <w:lang w:val="en-US"/>
-        </w:rPr>
-        <w:t xml:space="preserve"> </w:t>
-      </w:r>
-      <w:r>
-        <w:rPr>
-          <w:rFonts w:ascii="Times New Roman" w:hAnsi="Times New Roman" w:eastAsia="Times New Roman" w:cs="Times New Roman"/>
-          <w:color w:val="000000"/>
-          <w:lang w:val="en-US"/>
-        </w:rPr>
-        <w:t>ba</w:t>
-      </w:r>
-      <w:r>
-        <w:rPr>
-          <w:rFonts w:ascii="Times New Roman" w:hAnsi="Times New Roman" w:eastAsia="Times New Roman" w:cs="Times New Roman"/>
-          <w:color w:val="000000"/>
-          <w:lang w:val="en-US"/>
-        </w:rPr>
-        <w:t xml:space="preserve"> model </w:t>
-      </w:r>
-      <w:r>
-        <w:rPr>
-          <w:rFonts w:ascii="Times New Roman" w:hAnsi="Times New Roman" w:eastAsia="Times New Roman" w:cs="Times New Roman"/>
-          <w:color w:val="000000"/>
-          <w:lang w:val="en-US"/>
-        </w:rPr>
-        <w:t>đơn</w:t>
-      </w:r>
-      <w:r>
-        <w:rPr>
-          <w:rFonts w:ascii="Times New Roman" w:hAnsi="Times New Roman" w:eastAsia="Times New Roman" w:cs="Times New Roman"/>
-          <w:color w:val="000000"/>
-          <w:lang w:val="en-US"/>
-        </w:rPr>
-        <w:t xml:space="preserve"> </w:t>
-      </w:r>
-      <w:r>
-        <w:rPr>
-          <w:rFonts w:ascii="Times New Roman" w:hAnsi="Times New Roman" w:eastAsia="Times New Roman" w:cs="Times New Roman"/>
-          <w:color w:val="000000"/>
-          <w:lang w:val="en-US"/>
-        </w:rPr>
-        <w:t>trên</w:t>
-      </w:r>
-      <w:r>
-        <w:rPr>
-          <w:rFonts w:ascii="Times New Roman" w:hAnsi="Times New Roman" w:eastAsia="Times New Roman" w:cs="Times New Roman"/>
-          <w:color w:val="000000"/>
-          <w:lang w:val="en-US"/>
-        </w:rPr>
-        <w:t xml:space="preserve"> cả 5</w:t>
-      </w:r>
-      <w:r>
-        <w:rPr>
-          <w:rFonts w:ascii="Times New Roman" w:hAnsi="Times New Roman" w:eastAsia="Times New Roman" w:cs="Times New Roman"/>
-          <w:color w:val="000000"/>
-          <w:lang w:val="en-US"/>
-        </w:rPr>
-        <w:t xml:space="preserve"> fold</w:t>
-      </w:r>
-      <w:r>
-        <w:rPr>
-          <w:rFonts w:ascii="Times New Roman" w:hAnsi="Times New Roman" w:eastAsia="Times New Roman" w:cs="Times New Roman"/>
-          <w:color w:val="000000"/>
-          <w:lang w:val="en-US"/>
-        </w:rPr>
-        <w:t xml:space="preserve">, p = 0,031, </w:t>
-      </w:r>
-      <w:r>
-        <w:rPr>
-          <w:rFonts w:ascii="Times New Roman" w:hAnsi="Times New Roman" w:eastAsia="Times New Roman" w:cs="Times New Roman"/>
-          <w:color w:val="000000"/>
-          <w:lang w:val="en-US"/>
-        </w:rPr>
-        <w:t>xác</w:t>
-      </w:r>
-      <w:r>
-        <w:rPr>
-          <w:rFonts w:ascii="Times New Roman" w:hAnsi="Times New Roman" w:eastAsia="Times New Roman" w:cs="Times New Roman"/>
-          <w:color w:val="000000"/>
-          <w:lang w:val="en-US"/>
-        </w:rPr>
-        <w:t xml:space="preserve"> </w:t>
-      </w:r>
-      <w:r>
-        <w:rPr>
-          <w:rFonts w:ascii="Times New Roman" w:hAnsi="Times New Roman" w:eastAsia="Times New Roman" w:cs="Times New Roman"/>
-          <w:color w:val="000000"/>
-          <w:lang w:val="en-US"/>
-        </w:rPr>
-        <w:t>nhận</w:t>
-      </w:r>
-      <w:r>
-        <w:rPr>
-          <w:rFonts w:ascii="Times New Roman" w:hAnsi="Times New Roman" w:eastAsia="Times New Roman" w:cs="Times New Roman"/>
-          <w:color w:val="000000"/>
-          <w:lang w:val="en-US"/>
-        </w:rPr>
-        <w:t xml:space="preserve"> </w:t>
-      </w:r>
-      <w:r>
-        <w:rPr>
-          <w:rFonts w:ascii="Times New Roman" w:hAnsi="Times New Roman" w:eastAsia="Times New Roman" w:cs="Times New Roman"/>
-          <w:color w:val="000000"/>
-          <w:lang w:val="en-US"/>
-        </w:rPr>
-        <w:t>bằng</w:t>
-      </w:r>
-      <w:r>
-        <w:rPr>
-          <w:rFonts w:ascii="Times New Roman" w:hAnsi="Times New Roman" w:eastAsia="Times New Roman" w:cs="Times New Roman"/>
-          <w:color w:val="000000"/>
-          <w:lang w:val="en-US"/>
-        </w:rPr>
-        <w:t xml:space="preserve"> 5-fold CV </w:t>
-      </w:r>
-      <w:r>
-        <w:rPr>
-          <w:rFonts w:ascii="Times New Roman" w:hAnsi="Times New Roman" w:eastAsia="Times New Roman" w:cs="Times New Roman"/>
-          <w:color w:val="000000"/>
-          <w:lang w:val="en-US"/>
-        </w:rPr>
-        <w:t>theo</w:t>
-      </w:r>
-      <w:r>
-        <w:rPr>
-          <w:rFonts w:ascii="Times New Roman" w:hAnsi="Times New Roman" w:eastAsia="Times New Roman" w:cs="Times New Roman"/>
-          <w:color w:val="000000"/>
-          <w:lang w:val="en-US"/>
-        </w:rPr>
-        <w:t xml:space="preserve"> </w:t>
-      </w:r>
-      <w:r>
-        <w:rPr>
-          <w:rFonts w:ascii="Times New Roman" w:hAnsi="Times New Roman" w:eastAsia="Times New Roman" w:cs="Times New Roman"/>
-          <w:color w:val="000000"/>
-          <w:lang w:val="en-US"/>
-        </w:rPr>
-        <w:t>bệnh</w:t>
-      </w:r>
-      <w:r>
-        <w:rPr>
-          <w:rFonts w:ascii="Times New Roman" w:hAnsi="Times New Roman" w:eastAsia="Times New Roman" w:cs="Times New Roman"/>
-          <w:color w:val="000000"/>
-          <w:lang w:val="en-US"/>
-        </w:rPr>
-        <w:t xml:space="preserve"> </w:t>
-      </w:r>
-      <w:r>
-        <w:rPr>
-          <w:rFonts w:ascii="Times New Roman" w:hAnsi="Times New Roman" w:eastAsia="Times New Roman" w:cs="Times New Roman"/>
-          <w:color w:val="000000"/>
-          <w:lang w:val="en-US"/>
-        </w:rPr>
-        <w:t>nhân</w:t>
-      </w:r>
-      <w:r>
-        <w:rPr>
-          <w:rFonts w:ascii="Times New Roman" w:hAnsi="Times New Roman" w:eastAsia="Times New Roman" w:cs="Times New Roman"/>
-          <w:color w:val="000000"/>
-          <w:lang w:val="en-US"/>
-        </w:rPr>
-        <w:t>.</w:t>
+      </w:r>
+      <w:r>
+        <w:rPr>
+          <w:rFonts w:ascii="Times New Roman" w:hAnsi="Times New Roman" w:eastAsia="Times New Roman" w:cs="Times New Roman"/>
+          <w:color w:val="000000"/>
+          <w:lang w:val="en-US"/>
+        </w:rPr>
+      </w:r>
+      <w:r>
+        <w:rPr>
+          <w:rFonts w:ascii="Times New Roman" w:hAnsi="Times New Roman" w:eastAsia="Times New Roman" w:cs="Times New Roman"/>
+          <w:color w:val="000000"/>
+          <w:lang w:val="en-US"/>
+        </w:rPr>
+      </w:r>
+      <w:r>
+        <w:rPr>
+          <w:rFonts w:ascii="Times New Roman" w:hAnsi="Times New Roman" w:eastAsia="Times New Roman" w:cs="Times New Roman"/>
+          <w:color w:val="000000"/>
+          <w:lang w:val="en-US"/>
+        </w:rPr>
+      </w:r>
+      <w:r>
+        <w:rPr>
+          <w:rFonts w:ascii="Times New Roman" w:hAnsi="Times New Roman" w:eastAsia="Times New Roman" w:cs="Times New Roman"/>
+          <w:color w:val="000000"/>
+          <w:lang w:val="en-US"/>
+        </w:rPr>
+      </w:r>
+      <w:r>
+        <w:rPr>
+          <w:rFonts w:ascii="Times New Roman" w:hAnsi="Times New Roman" w:eastAsia="Times New Roman" w:cs="Times New Roman"/>
+          <w:color w:val="000000"/>
+          <w:lang w:val="en-US"/>
+        </w:rPr>
+      </w:r>
+      <w:r>
+        <w:rPr>
+          <w:rFonts w:ascii="Times New Roman" w:hAnsi="Times New Roman" w:eastAsia="Times New Roman" w:cs="Times New Roman"/>
+          <w:color w:val="000000"/>
+          <w:lang w:val="en-US"/>
+        </w:rPr>
+      </w:r>
+      <w:r>
+        <w:rPr>
+          <w:rFonts w:ascii="Times New Roman" w:hAnsi="Times New Roman" w:eastAsia="Times New Roman" w:cs="Times New Roman"/>
+          <w:color w:val="000000"/>
+          <w:lang w:val="en-US"/>
+        </w:rPr>
+      </w:r>
+      <w:r>
+        <w:rPr>
+          <w:rFonts w:ascii="Times New Roman" w:hAnsi="Times New Roman" w:eastAsia="Times New Roman" w:cs="Times New Roman"/>
+          <w:color w:val="000000"/>
+          <w:lang w:val="en-US"/>
+        </w:rPr>
+      </w:r>
+      <w:r>
+        <w:rPr>
+          <w:rFonts w:ascii="Times New Roman" w:hAnsi="Times New Roman" w:eastAsia="Times New Roman" w:cs="Times New Roman"/>
+          <w:color w:val="000000"/>
+          <w:lang w:val="en-US"/>
+        </w:rPr>
+      </w:r>
+      <w:r>
+        <w:rPr>
+          <w:rFonts w:ascii="Times New Roman" w:hAnsi="Times New Roman" w:eastAsia="Times New Roman" w:cs="Times New Roman"/>
+          <w:color w:val="000000"/>
+          <w:lang w:val="en-US"/>
+        </w:rPr>
+      </w:r>
+      <w:r>
+        <w:rPr>
+          <w:rFonts w:ascii="Times New Roman" w:hAnsi="Times New Roman" w:eastAsia="Times New Roman" w:cs="Times New Roman"/>
+          <w:color w:val="000000"/>
+          <w:lang w:val="en-US"/>
+        </w:rPr>
+      </w:r>
+      <w:r>
+        <w:rPr>
+          <w:rFonts w:ascii="Times New Roman" w:hAnsi="Times New Roman" w:eastAsia="Times New Roman" w:cs="Times New Roman"/>
+          <w:color w:val="000000"/>
+          <w:lang w:val="en-US"/>
+        </w:rPr>
+      </w:r>
+      <w:r>
+        <w:rPr>
+          <w:rFonts w:ascii="Times New Roman" w:hAnsi="Times New Roman" w:eastAsia="Times New Roman" w:cs="Times New Roman"/>
+          <w:color w:val="000000"/>
+          <w:lang w:val="en-US"/>
+        </w:rPr>
+      </w:r>
+      <w:r>
+        <w:rPr>
+          <w:rFonts w:ascii="Times New Roman" w:hAnsi="Times New Roman" w:eastAsia="Times New Roman" w:cs="Times New Roman"/>
+          <w:color w:val="000000"/>
+          <w:lang w:val="en-US"/>
+        </w:rPr>
+      </w:r>
+      <w:r>
+        <w:rPr>
+          <w:rFonts w:ascii="Times New Roman" w:hAnsi="Times New Roman" w:eastAsia="Times New Roman" w:cs="Times New Roman"/>
+          <w:color w:val="000000"/>
+          <w:lang w:val="en-US"/>
+        </w:rPr>
+      </w:r>
+      <w:r>
+        <w:rPr>
+          <w:rFonts w:ascii="Times New Roman" w:hAnsi="Times New Roman" w:eastAsia="Times New Roman" w:cs="Times New Roman"/>
+          <w:color w:val="000000"/>
+          <w:lang w:val="en-US"/>
+        </w:rPr>
+      </w:r>
+      <w:r>
+        <w:rPr>
+          <w:rFonts w:ascii="Times New Roman" w:hAnsi="Times New Roman" w:eastAsia="Times New Roman" w:cs="Times New Roman"/>
+          <w:color w:val="000000"/>
+          <w:lang w:val="en-US"/>
+        </w:rPr>
+      </w:r>
+      <w:r>
+        <w:rPr>
+          <w:rFonts w:ascii="Times New Roman" w:hAnsi="Times New Roman" w:eastAsia="Times New Roman" w:cs="Times New Roman"/>
+          <w:color w:val="000000"/>
+          <w:lang w:val="en-US"/>
+        </w:rPr>
+      </w:r>
+      <w:r>
+        <w:rPr>
+          <w:rFonts w:ascii="Times New Roman" w:hAnsi="Times New Roman" w:eastAsia="Times New Roman" w:cs="Times New Roman"/>
+          <w:color w:val="000000"/>
+          <w:lang w:val="en-US"/>
+        </w:rPr>
+      </w:r>
+      <w:r>
+        <w:rPr>
+          <w:rFonts w:ascii="Times New Roman" w:hAnsi="Times New Roman" w:eastAsia="Times New Roman" w:cs="Times New Roman"/>
+          <w:color w:val="000000"/>
+          <w:lang w:val="en-US"/>
+        </w:rPr>
+      </w:r>
+      <w:r>
+        <w:rPr>
+          <w:rFonts w:ascii="Times New Roman" w:hAnsi="Times New Roman" w:eastAsia="Times New Roman" w:cs="Times New Roman"/>
+          <w:color w:val="000000"/>
+          <w:lang w:val="en-US"/>
+        </w:rPr>
+      </w:r>
+      <w:r>
+        <w:rPr>
+          <w:rFonts w:ascii="Times New Roman" w:hAnsi="Times New Roman" w:eastAsia="Times New Roman" w:cs="Times New Roman"/>
+          <w:color w:val="000000"/>
+          <w:lang w:val="en-US"/>
+        </w:rPr>
+      </w:r>
+      <w:r>
+        <w:rPr>
+          <w:rFonts w:ascii="Times New Roman" w:hAnsi="Times New Roman" w:eastAsia="Times New Roman" w:cs="Times New Roman"/>
+          <w:color w:val="000000"/>
+          <w:lang w:val="en-US"/>
+        </w:rPr>
+      </w:r>
+      <w:r>
+        <w:rPr>
+          <w:rFonts w:ascii="Times New Roman" w:hAnsi="Times New Roman" w:eastAsia="Times New Roman" w:cs="Times New Roman"/>
+          <w:color w:val="000000"/>
+          <w:lang w:val="en-US"/>
+        </w:rPr>
+      </w:r>
+      <w:r>
+        <w:rPr>
+          <w:rFonts w:ascii="Times New Roman" w:hAnsi="Times New Roman" w:eastAsia="Times New Roman" w:cs="Times New Roman"/>
+          <w:color w:val="000000"/>
+          <w:lang w:val="en-US"/>
+        </w:rPr>
+      </w:r>
+      <w:r>
+        <w:rPr>
+          <w:rFonts w:ascii="Times New Roman" w:hAnsi="Times New Roman" w:eastAsia="Times New Roman" w:cs="Times New Roman"/>
+          <w:color w:val="000000"/>
+          <w:lang w:val="en-US"/>
+        </w:rPr>
       </w:r>
     </w:p>
     <w:p xmlns:wp14="http://schemas.microsoft.com/office/word/2010/wordml" wp14:textId="3D67617A">

</xml_diff>